<commit_message>
Add root index.html and vercel.json for seamless Vercel deployment
</commit_message>
<xml_diff>
--- a/Docs and Notes/Krishna_Utsav_2026_Project_Documentation.docx
+++ b/Docs and Notes/Krishna_Utsav_2026_Project_Documentation.docx
@@ -1379,7 +1379,7 @@
               <w:rPr>
                 <w:b/>
               </w:rPr>
-              <w:t>HTML and CSS/</w:t>
+              <w:t>index.html, vercel.json</w:t>
             </w:r>
           </w:p>
         </w:tc>
@@ -1389,7 +1389,7 @@
           </w:tcPr>
           <w:p>
             <w:r>
-              <w:t>index.html, index.css</w:t>
+              <w:t>Root entry files</w:t>
             </w:r>
           </w:p>
         </w:tc>
@@ -1399,7 +1399,7 @@
           </w:tcPr>
           <w:p>
             <w:r>
-              <w:t>Semantic structure, layout templates, glassmorphism design tokens</w:t>
+              <w:t>Zero-config root entry point for Vercel, Netlify, and Cloud CDNs to prevent 404s</w:t>
             </w:r>
           </w:p>
         </w:tc>
@@ -1415,7 +1415,7 @@
               <w:rPr>
                 <w:b/>
               </w:rPr>
-              <w:t>Java Script/</w:t>
+              <w:t>HTML and CSS/</w:t>
             </w:r>
           </w:p>
         </w:tc>
@@ -1426,7 +1426,7 @@
           </w:tcPr>
           <w:p>
             <w:r>
-              <w:t>index.js</w:t>
+              <w:t>index.html, index.css</w:t>
             </w:r>
           </w:p>
         </w:tc>
@@ -1437,7 +1437,7 @@
           </w:tcPr>
           <w:p>
             <w:r>
-              <w:t>Client interaction, carousels, audio gesture handlers, screensaver logic</w:t>
+              <w:t>Semantic structure, layout templates, glassmorphism design tokens</w:t>
             </w:r>
           </w:p>
         </w:tc>
@@ -1452,7 +1452,7 @@
               <w:rPr>
                 <w:b/>
               </w:rPr>
-              <w:t>Data and Config/</w:t>
+              <w:t>Java Script/</w:t>
             </w:r>
           </w:p>
         </w:tc>
@@ -1462,7 +1462,7 @@
           </w:tcPr>
           <w:p>
             <w:r>
-              <w:t>nginx.conf</w:t>
+              <w:t>index.js</w:t>
             </w:r>
           </w:p>
         </w:tc>
@@ -1472,7 +1472,7 @@
           </w:tcPr>
           <w:p>
             <w:r>
-              <w:t>Custom Nginx web server configuration, Gzip types &amp; redirect rules</w:t>
+              <w:t>Client interaction, carousels, audio gesture handlers, screensaver logic</w:t>
             </w:r>
           </w:p>
         </w:tc>
@@ -1488,7 +1488,7 @@
               <w:rPr>
                 <w:b/>
               </w:rPr>
-              <w:t>Image and Audio/</w:t>
+              <w:t>Data and Config/</w:t>
             </w:r>
           </w:p>
         </w:tc>
@@ -1499,7 +1499,7 @@
           </w:tcPr>
           <w:p>
             <w:r>
-              <w:t>Flute audio, photos</w:t>
+              <w:t>nginx.conf</w:t>
             </w:r>
           </w:p>
         </w:tc>
@@ -1510,7 +1510,7 @@
           </w:tcPr>
           <w:p>
             <w:r>
-              <w:t>Devotional background audio (mp3), peacock feather textures &amp; images</w:t>
+              <w:t>Custom Nginx web server configuration, Gzip types &amp; redirect rules</w:t>
             </w:r>
           </w:p>
         </w:tc>
@@ -1525,7 +1525,7 @@
               <w:rPr>
                 <w:b/>
               </w:rPr>
-              <w:t>Python Scripts/</w:t>
+              <w:t>Image and Audio/</w:t>
             </w:r>
           </w:p>
         </w:tc>
@@ -1535,7 +1535,7 @@
           </w:tcPr>
           <w:p>
             <w:r>
-              <w:t>generate_docs.py</w:t>
+              <w:t>Flute audio, photos</w:t>
             </w:r>
           </w:p>
         </w:tc>
@@ -1545,7 +1545,7 @@
           </w:tcPr>
           <w:p>
             <w:r>
-              <w:t>Automated Word document documentation generator scripts</w:t>
+              <w:t>Devotional background audio (mp3), peacock feather textures &amp; images</w:t>
             </w:r>
           </w:p>
         </w:tc>
@@ -1561,7 +1561,7 @@
               <w:rPr>
                 <w:b/>
               </w:rPr>
-              <w:t>Docs and Notes/</w:t>
+              <w:t>Python Scripts/</w:t>
             </w:r>
           </w:p>
         </w:tc>
@@ -1572,7 +1572,7 @@
           </w:tcPr>
           <w:p>
             <w:r>
-              <w:t>.docx documentation</w:t>
+              <w:t>generate_docs.py, create_root_entry.py</w:t>
             </w:r>
           </w:p>
         </w:tc>
@@ -1583,7 +1583,7 @@
           </w:tcPr>
           <w:p>
             <w:r>
-              <w:t>Formal project documentation files created for college submission</w:t>
+              <w:t>Automated Word documentation and root HTML synchronization scripts</w:t>
             </w:r>
           </w:p>
         </w:tc>
@@ -1598,6 +1598,42 @@
               <w:rPr>
                 <w:b/>
               </w:rPr>
+              <w:t>Docs and Notes/</w:t>
+            </w:r>
+          </w:p>
+        </w:tc>
+        <w:tc>
+          <w:tcPr>
+            <w:tcW w:type="dxa" w:w="3120"/>
+          </w:tcPr>
+          <w:p>
+            <w:r>
+              <w:t>.docx documentation</w:t>
+            </w:r>
+          </w:p>
+        </w:tc>
+        <w:tc>
+          <w:tcPr>
+            <w:tcW w:type="dxa" w:w="3120"/>
+          </w:tcPr>
+          <w:p>
+            <w:r>
+              <w:t>Formal project documentation files created for college submission</w:t>
+            </w:r>
+          </w:p>
+        </w:tc>
+      </w:tr>
+      <w:tr>
+        <w:tc>
+          <w:tcPr>
+            <w:tcW w:type="dxa" w:w="3120"/>
+            <w:shd w:fill="F4F6FB"/>
+          </w:tcPr>
+          <w:p>
+            <w:r>
+              <w:rPr>
+                <w:b/>
+              </w:rPr>
               <w:t>Root Configs</w:t>
             </w:r>
           </w:p>
@@ -1605,6 +1641,7 @@
         <w:tc>
           <w:tcPr>
             <w:tcW w:type="dxa" w:w="3120"/>
+            <w:shd w:fill="F4F6FB"/>
           </w:tcPr>
           <w:p>
             <w:r>
@@ -1615,6 +1652,7 @@
         <w:tc>
           <w:tcPr>
             <w:tcW w:type="dxa" w:w="3120"/>
+            <w:shd w:fill="F4F6FB"/>
           </w:tcPr>
           <w:p>
             <w:r>
@@ -2648,6 +2686,76 @@
       </w:pPr>
     </w:p>
     <w:p>
+      <w:pPr>
+        <w:keepNext/>
+        <w:spacing w:before="280" w:after="120"/>
+      </w:pPr>
+      <w:r>
+        <w:rPr>
+          <w:rFonts w:ascii="Arial" w:hAnsi="Arial"/>
+          <w:b/>
+          <w:color w:val="C6A15B"/>
+          <w:sz w:val="28"/>
+        </w:rPr>
+        <w:t>6.3 Cloud Edge Deployment &amp; Vercel Static Hosting Architecture</w:t>
+      </w:r>
+    </w:p>
+    <w:p>
+      <w:r>
+        <w:t>For global edge delivery without Docker infrastructure, the repository is configured for instantaneous deployment on Vercel, Netlify, and GitHub Pages. Modern cloud static hosts look for `index.html` at the repository root by default.</w:t>
+      </w:r>
+    </w:p>
+    <w:p>
+      <w:r>
+        <w:t>To prevent 404 routing errors upon initial deployment, the project provides a synchronized root `index.html` with calibrated relative asset bindings (`HTML and CSS/index.css`, `Java Script/index.js`, `Image and Audio/`), paired with a root `vercel.json` configuration file enabling clean URLs and resilient path routing.</w:t>
+      </w:r>
+    </w:p>
+    <w:tbl>
+      <w:tblPr>
+        <w:tblW w:type="auto" w:w="0"/>
+        <w:jc w:val="center"/>
+        <w:tblLook w:firstColumn="1" w:firstRow="1" w:lastColumn="0" w:lastRow="0" w:noHBand="0" w:noVBand="1" w:val="04A0"/>
+      </w:tblPr>
+      <w:tblGrid>
+        <w:gridCol w:w="9360"/>
+      </w:tblGrid>
+      <w:tr>
+        <w:tc>
+          <w:tcPr>
+            <w:tcW w:type="dxa" w:w="9360"/>
+            <w:shd w:fill="2B2D42"/>
+          </w:tcPr>
+          <w:p>
+            <w:pPr>
+              <w:spacing w:before="120" w:after="120"/>
+              <w:ind w:left="144"/>
+            </w:pPr>
+            <w:r>
+              <w:rPr>
+                <w:rFonts w:ascii="Consolas" w:hAnsi="Consolas"/>
+                <w:color w:val="F0F0F0"/>
+                <w:sz w:val="19"/>
+              </w:rPr>
+              <w:t>// vercel.json - Edge static hosting configuration</w:t>
+              <w:br/>
+              <w:t>{</w:t>
+              <w:br/>
+              <w:t xml:space="preserve">  "cleanUrls": true,</w:t>
+              <w:br/>
+              <w:t xml:space="preserve">  "trailingSlash": false</w:t>
+              <w:br/>
+              <w:t>}</w:t>
+            </w:r>
+          </w:p>
+        </w:tc>
+      </w:tr>
+    </w:tbl>
+    <w:p>
+      <w:pPr>
+        <w:spacing w:after="120"/>
+      </w:pPr>
+    </w:p>
+    <w:p>
       <w:r>
         <w:br w:type="page"/>
       </w:r>

</xml_diff>

<commit_message>
Enhance mobile responsiveness with touch swipe carousels and sync project documentation
</commit_message>
<xml_diff>
--- a/Docs and Notes/Krishna_Utsav_2026_Project_Documentation.docx
+++ b/Docs and Notes/Krishna_Utsav_2026_Project_Documentation.docx
@@ -2221,6 +2221,56 @@
       </w:r>
     </w:p>
     <w:p>
+      <w:pPr>
+        <w:keepNext/>
+        <w:spacing w:before="280" w:after="120"/>
+      </w:pPr>
+      <w:r>
+        <w:rPr>
+          <w:rFonts w:ascii="Arial" w:hAnsi="Arial"/>
+          <w:b/>
+          <w:color w:val="C6A15B"/>
+          <w:sz w:val="28"/>
+        </w:rPr>
+        <w:t>4.5 Mobile Touch Gesture Support &amp; Ergonomic Thumb Navigation</w:t>
+      </w:r>
+    </w:p>
+    <w:p>
+      <w:r>
+        <w:t>To provide a mobile app-grade user experience on touch-enabled smartphones and tablets, the twin carousel system incorporates passive touch swipe gesture detection. Users can fluidly swipe left to advance to the next event or gallery image, or swipe right to return to the previous item, calculated via horizontal touch delta analysis.</w:t>
+      </w:r>
+    </w:p>
+    <w:p>
+      <w:r>
+        <w:t>Furthermore, the mobile UI layout shifts carousel navigation controls from side arrows (which frequently obscure card content on narrow screens) to dedicated bottom-centered thumb buttons. This ergonomic placement enables effortless one-handed operation on devices under 768px.</w:t>
+      </w:r>
+    </w:p>
+    <w:p>
+      <w:pPr>
+        <w:keepNext/>
+        <w:spacing w:before="280" w:after="120"/>
+      </w:pPr>
+      <w:r>
+        <w:rPr>
+          <w:rFonts w:ascii="Arial" w:hAnsi="Arial"/>
+          <w:b/>
+          <w:color w:val="C6A15B"/>
+          <w:sz w:val="28"/>
+        </w:rPr>
+        <w:t>4.6 Fixed Navigation Scroll Offset &amp; Clean Viewport Calibration</w:t>
+      </w:r>
+    </w:p>
+    <w:p>
+      <w:r>
+        <w:t>A notorious usability defect in single-page web applications with sticky or fixed headers is that clicking anchor navigation links causes target section titles to be partially or completely obscured behind the navigation bar. The Krishna Utsav portal permanently resolves this through CSS 'scroll-padding-top: 85px' at root level paired with 'scroll-margin-top: 85px' (75px on mobile) on every section.</w:t>
+      </w:r>
+    </w:p>
+    <w:p>
+      <w:r>
+        <w:t>To guarantee an uncluttered visual hierarchy on small screens, decorative corner ornaments are automatically suppressed on mobile viewports via media queries, background feather opacity is attenuated to 0.05, and divine hero halo dimensions are scaled adaptively.</w:t>
+      </w:r>
+    </w:p>
+    <w:p>
       <w:r>
         <w:br w:type="page"/>
       </w:r>
@@ -2478,6 +2528,222 @@
               <w:t xml:space="preserve">    gzip on;</w:t>
               <w:br/>
               <w:t xml:space="preserve">    gzip_types text/plain text/css application/json application/javascript text/xml image/svg+xml audio/mpeg;</w:t>
+              <w:br/>
+              <w:t>}</w:t>
+            </w:r>
+          </w:p>
+        </w:tc>
+      </w:tr>
+    </w:tbl>
+    <w:p>
+      <w:pPr>
+        <w:spacing w:after="120"/>
+      </w:pPr>
+    </w:p>
+    <w:p>
+      <w:pPr>
+        <w:keepNext/>
+        <w:spacing w:before="280" w:after="120"/>
+      </w:pPr>
+      <w:r>
+        <w:rPr>
+          <w:rFonts w:ascii="Arial" w:hAnsi="Arial"/>
+          <w:b/>
+          <w:color w:val="C6A15B"/>
+          <w:sz w:val="28"/>
+        </w:rPr>
+        <w:t>5.4 Mobile Touch Swipe Gesture Tracking (Java Script/index.js)</w:t>
+      </w:r>
+    </w:p>
+    <w:p>
+      <w:r>
+        <w:t>To enable smooth swipe navigation on touchscreens, the carousel component tracks touch coordinates and compares start and end offsets:</w:t>
+      </w:r>
+    </w:p>
+    <w:tbl>
+      <w:tblPr>
+        <w:tblW w:type="auto" w:w="0"/>
+        <w:jc w:val="center"/>
+        <w:tblLook w:firstColumn="1" w:firstRow="1" w:lastColumn="0" w:lastRow="0" w:noHBand="0" w:noVBand="1" w:val="04A0"/>
+      </w:tblPr>
+      <w:tblGrid>
+        <w:gridCol w:w="9360"/>
+      </w:tblGrid>
+      <w:tr>
+        <w:tc>
+          <w:tcPr>
+            <w:tcW w:type="dxa" w:w="9360"/>
+            <w:shd w:fill="2B2D42"/>
+          </w:tcPr>
+          <w:p>
+            <w:pPr>
+              <w:spacing w:before="120" w:after="120"/>
+              <w:ind w:left="144"/>
+            </w:pPr>
+            <w:r>
+              <w:rPr>
+                <w:rFonts w:ascii="Consolas" w:hAnsi="Consolas"/>
+                <w:color w:val="F0F0F0"/>
+                <w:sz w:val="19"/>
+              </w:rPr>
+              <w:t>// Support touch swipe gestures on mobile and touch displays</w:t>
+              <w:br/>
+              <w:t>let touchStartX = 0;</w:t>
+              <w:br/>
+              <w:t>let touchEndX = 0;</w:t>
+              <w:br/>
+              <w:br/>
+              <w:t>track.addEventListener('touchstart', (e) =&gt; {</w:t>
+              <w:br/>
+              <w:t xml:space="preserve">    touchStartX = e.changedTouches[0].screenX;</w:t>
+              <w:br/>
+              <w:t>}, { passive: true });</w:t>
+              <w:br/>
+              <w:br/>
+              <w:t>track.addEventListener('touchend', (e) =&gt; {</w:t>
+              <w:br/>
+              <w:t xml:space="preserve">    touchEndX = e.changedTouches[0].screenX;</w:t>
+              <w:br/>
+              <w:t xml:space="preserve">    const diffX = touchStartX - touchEndX;</w:t>
+              <w:br/>
+              <w:t xml:space="preserve">    if (Math.abs(diffX) &gt; 40) {</w:t>
+              <w:br/>
+              <w:t xml:space="preserve">        if (diffX &gt; 0) {</w:t>
+              <w:br/>
+              <w:t xml:space="preserve">            // Swiped left -&gt; Next item</w:t>
+              <w:br/>
+              <w:t xml:space="preserve">            const maxIndex = cards.length - getVisibleCount();</w:t>
+              <w:br/>
+              <w:t xml:space="preserve">            if (currentIndex &lt; maxIndex) {</w:t>
+              <w:br/>
+              <w:t xml:space="preserve">                currentIndex++;</w:t>
+              <w:br/>
+              <w:t xml:space="preserve">                updateSlider();</w:t>
+              <w:br/>
+              <w:t xml:space="preserve">            }</w:t>
+              <w:br/>
+              <w:t xml:space="preserve">        } else {</w:t>
+              <w:br/>
+              <w:t xml:space="preserve">            // Swiped right -&gt; Previous item</w:t>
+              <w:br/>
+              <w:t xml:space="preserve">            if (currentIndex &gt; 0) {</w:t>
+              <w:br/>
+              <w:t xml:space="preserve">                currentIndex--;</w:t>
+              <w:br/>
+              <w:t xml:space="preserve">                updateSlider();</w:t>
+              <w:br/>
+              <w:t xml:space="preserve">            }</w:t>
+              <w:br/>
+              <w:t xml:space="preserve">        }</w:t>
+              <w:br/>
+              <w:t xml:space="preserve">    }</w:t>
+              <w:br/>
+              <w:t>}, { passive: true });</w:t>
+            </w:r>
+          </w:p>
+        </w:tc>
+      </w:tr>
+    </w:tbl>
+    <w:p>
+      <w:pPr>
+        <w:spacing w:after="120"/>
+      </w:pPr>
+    </w:p>
+    <w:p>
+      <w:pPr>
+        <w:keepNext/>
+        <w:spacing w:before="280" w:after="120"/>
+      </w:pPr>
+      <w:r>
+        <w:rPr>
+          <w:rFonts w:ascii="Arial" w:hAnsi="Arial"/>
+          <w:b/>
+          <w:color w:val="C6A15B"/>
+          <w:sz w:val="28"/>
+        </w:rPr>
+        <w:t>5.5 Ergonomic Mobile Carousel &amp; Anchor Offset Rules (HTML and CSS/index.css)</w:t>
+      </w:r>
+    </w:p>
+    <w:p>
+      <w:r>
+        <w:t>Fixed-header offset rules and bottom-aligned thumb controls on mobile viewports:</w:t>
+      </w:r>
+    </w:p>
+    <w:tbl>
+      <w:tblPr>
+        <w:tblW w:type="auto" w:w="0"/>
+        <w:jc w:val="center"/>
+        <w:tblLook w:firstColumn="1" w:firstRow="1" w:lastColumn="0" w:lastRow="0" w:noHBand="0" w:noVBand="1" w:val="04A0"/>
+      </w:tblPr>
+      <w:tblGrid>
+        <w:gridCol w:w="9360"/>
+      </w:tblGrid>
+      <w:tr>
+        <w:tc>
+          <w:tcPr>
+            <w:tcW w:type="dxa" w:w="9360"/>
+            <w:shd w:fill="2B2D42"/>
+          </w:tcPr>
+          <w:p>
+            <w:pPr>
+              <w:spacing w:before="120" w:after="120"/>
+              <w:ind w:left="144"/>
+            </w:pPr>
+            <w:r>
+              <w:rPr>
+                <w:rFonts w:ascii="Consolas" w:hAnsi="Consolas"/>
+                <w:color w:val="F0F0F0"/>
+                <w:sz w:val="19"/>
+              </w:rPr>
+              <w:t>/* Root and section anchor scroll offset compensation */</w:t>
+              <w:br/>
+              <w:t>html {</w:t>
+              <w:br/>
+              <w:t xml:space="preserve">    scroll-behavior: smooth;</w:t>
+              <w:br/>
+              <w:t xml:space="preserve">    scroll-padding-top: 85px;</w:t>
+              <w:br/>
+              <w:t>}</w:t>
+              <w:br/>
+              <w:br/>
+              <w:t>section {</w:t>
+              <w:br/>
+              <w:t xml:space="preserve">    scroll-margin-top: 85px;</w:t>
+              <w:br/>
+              <w:t>}</w:t>
+              <w:br/>
+              <w:br/>
+              <w:t>/* Responsive mobile carousel: bottom thumb controls &amp; full-width cards */</w:t>
+              <w:br/>
+              <w:t>@media (max-width: 768px) {</w:t>
+              <w:br/>
+              <w:t xml:space="preserve">    .carousel-container {</w:t>
+              <w:br/>
+              <w:t xml:space="preserve">        position: relative;</w:t>
+              <w:br/>
+              <w:t xml:space="preserve">        padding-bottom: 60px;</w:t>
+              <w:br/>
+              <w:t xml:space="preserve">    }</w:t>
+              <w:br/>
+              <w:t xml:space="preserve">    .slider-track .event-card,</w:t>
+              <w:br/>
+              <w:t xml:space="preserve">    .slider-track .gallery-card {</w:t>
+              <w:br/>
+              <w:t xml:space="preserve">        flex: 0 0 100%;</w:t>
+              <w:br/>
+              <w:t xml:space="preserve">    }</w:t>
+              <w:br/>
+              <w:t xml:space="preserve">    .carousel-ctrl-btn {</w:t>
+              <w:br/>
+              <w:t xml:space="preserve">        position: absolute;</w:t>
+              <w:br/>
+              <w:t xml:space="preserve">        bottom: 0;</w:t>
+              <w:br/>
+              <w:t xml:space="preserve">    }</w:t>
+              <w:br/>
+              <w:t xml:space="preserve">    .carousel-ctrl-btn.prev { left: calc(50% - 55px); }</w:t>
+              <w:br/>
+              <w:t xml:space="preserve">    .carousel-ctrl-btn.next { right: calc(50% - 55px); }</w:t>
               <w:br/>
               <w:t>}</w:t>
             </w:r>
@@ -2894,7 +3160,7 @@
           </w:tcPr>
           <w:p>
             <w:r>
-              <w:t>375px - 480px</w:t>
+              <w:t>&lt; 480px</w:t>
             </w:r>
           </w:p>
         </w:tc>
@@ -2904,7 +3170,7 @@
           </w:tcPr>
           <w:p>
             <w:r>
-              <w:t>Single card carousel column, hamburger nav drawer active</w:t>
+              <w:t>Single card carousel, touch swipe gestures, bottom thumb controls, full-width CTA buttons, hidden ornaments</w:t>
             </w:r>
           </w:p>
         </w:tc>
@@ -2931,7 +3197,7 @@
           </w:tcPr>
           <w:p>
             <w:r>
-              <w:t>Tablet Portrait</w:t>
+              <w:t>Mobile / Small Tablet</w:t>
             </w:r>
           </w:p>
         </w:tc>
@@ -2942,7 +3208,7 @@
           </w:tcPr>
           <w:p>
             <w:r>
-              <w:t>768px - 900px</w:t>
+              <w:t>481px - 768px</w:t>
             </w:r>
           </w:p>
         </w:tc>
@@ -2953,7 +3219,7 @@
           </w:tcPr>
           <w:p>
             <w:r>
-              <w:t>2-card carousel slider layout, stacked stat counters</w:t>
+              <w:t>Full-width carousel cards with bottom-centered buttons, 75px fixed-header scroll padding, drawer nav</w:t>
             </w:r>
           </w:p>
         </w:tc>
@@ -2980,7 +3246,7 @@
           </w:tcPr>
           <w:p>
             <w:r>
-              <w:t>Laptop / Desktop</w:t>
+              <w:t>Tablet Landscape</w:t>
             </w:r>
           </w:p>
         </w:tc>
@@ -2990,7 +3256,7 @@
           </w:tcPr>
           <w:p>
             <w:r>
-              <w:t>1024px - 1440px</w:t>
+              <w:t>769px - 992px</w:t>
             </w:r>
           </w:p>
         </w:tc>
@@ -3000,7 +3266,7 @@
           </w:tcPr>
           <w:p>
             <w:r>
-              <w:t>3-card carousel slider track, inline desktop navigation link bar</w:t>
+              <w:t>2-card carousel slider track, side arrows, 85px fixed-header scroll padding</w:t>
             </w:r>
           </w:p>
         </w:tc>
@@ -3027,7 +3293,7 @@
           </w:tcPr>
           <w:p>
             <w:r>
-              <w:t>Ultra-Wide Monitor</w:t>
+              <w:t>Laptop / Desktop</w:t>
             </w:r>
           </w:p>
         </w:tc>
@@ -3038,7 +3304,7 @@
           </w:tcPr>
           <w:p>
             <w:r>
-              <w:t>1920px+</w:t>
+              <w:t>1024px - 1440px</w:t>
             </w:r>
           </w:p>
         </w:tc>
@@ -3049,7 +3315,7 @@
           </w:tcPr>
           <w:p>
             <w:r>
-              <w:t>Max-width container clamping (1200px limit), centered hero halo</w:t>
+              <w:t>3-card carousel slider track, inline desktop navigation link bar, full halo effects</w:t>
             </w:r>
           </w:p>
         </w:tc>
@@ -3057,6 +3323,52 @@
           <w:tcPr>
             <w:tcW w:type="dxa" w:w="2340"/>
             <w:shd w:fill="F4F6FB"/>
+          </w:tcPr>
+          <w:p>
+            <w:r>
+              <w:rPr>
+                <w:b/>
+                <w:color w:val="2E7D32"/>
+              </w:rPr>
+              <w:t>PASSED [100%]</w:t>
+            </w:r>
+          </w:p>
+        </w:tc>
+      </w:tr>
+      <w:tr>
+        <w:tc>
+          <w:tcPr>
+            <w:tcW w:type="dxa" w:w="2340"/>
+          </w:tcPr>
+          <w:p>
+            <w:r>
+              <w:t>Ultra-Wide Monitor</w:t>
+            </w:r>
+          </w:p>
+        </w:tc>
+        <w:tc>
+          <w:tcPr>
+            <w:tcW w:type="dxa" w:w="2340"/>
+          </w:tcPr>
+          <w:p>
+            <w:r>
+              <w:t>1920px+</w:t>
+            </w:r>
+          </w:p>
+        </w:tc>
+        <w:tc>
+          <w:tcPr>
+            <w:tcW w:type="dxa" w:w="2340"/>
+          </w:tcPr>
+          <w:p>
+            <w:r>
+              <w:t>Max-width container clamping (1400px limit), centered hero halo &amp; layout</w:t>
+            </w:r>
+          </w:p>
+        </w:tc>
+        <w:tc>
+          <w:tcPr>
+            <w:tcW w:type="dxa" w:w="2340"/>
           </w:tcPr>
           <w:p>
             <w:r>

</xml_diff>